<commit_message>
minor change in LCP03
</commit_message>
<xml_diff>
--- a/6. Documentation With Templates/LCP03 HARA/LCP03-AIRBAG-ECU-001_HARA_v110.docx
+++ b/6. Documentation With Templates/LCP03 HARA/LCP03-AIRBAG-ECU-001_HARA_v110.docx
@@ -432,7 +432,7 @@
       </w:tr>
       <w:tr>
         <w:trPr>
-          <w:trHeight w:val="213"/>
+          <w:trHeight w:val="221"/>
         </w:trPr>
         <w:tc>
           <w:tcPr>
@@ -460,7 +460,7 @@
                 <w:sz w:val="18"/>
                 <w:szCs w:val="18"/>
               </w:rPr>
-              <w:t>Status</w:t>
+              <w:t>Editor</w:t>
             </w:r>
           </w:p>
         </w:tc>
@@ -483,142 +483,85 @@
             <w:vAlign w:val="center"/>
           </w:tcPr>
           <w:p>
-            <w:r>
+            <w:pPr>
               <w:rPr>
                 <w:sz w:val="18"/>
                 <w:szCs w:val="18"/>
               </w:rPr>
-              <w:t>DRAFT</w:t>
-            </w:r>
-          </w:p>
-        </w:tc>
-      </w:tr>
-      <w:tr>
-        <w:trPr>
-          <w:trHeight w:val="221"/>
-        </w:trPr>
-        <w:tc>
-          <w:tcPr>
-            <w:tcW w:w="3073" w:type="dxa"/>
-            <w:tcBorders>
-              <w:top w:val="single" w:sz="4" w:space="0" w:color="BFBFBF"/>
-              <w:left w:val="single" w:sz="4" w:space="0" w:color="BFBFBF"/>
-              <w:bottom w:val="single" w:sz="4" w:space="0" w:color="BFBFBF"/>
-              <w:right w:val="single" w:sz="4" w:space="0" w:color="BFBFBF"/>
-            </w:tcBorders>
-            <w:shd w:val="clear" w:color="auto" w:fill="EBF3FB"/>
-            <w:tcMar>
-              <w:top w:w="70" w:type="dxa"/>
-              <w:left w:w="120" w:type="dxa"/>
-              <w:bottom w:w="70" w:type="dxa"/>
-              <w:right w:w="120" w:type="dxa"/>
-            </w:tcMar>
-          </w:tcPr>
-          <w:p>
-            <w:r>
-              <w:rPr>
-                <w:b/>
-                <w:bCs/>
-                <w:color w:val="1F3864"/>
+            </w:pPr>
+            <w:r>
+              <w:rPr>
                 <w:sz w:val="18"/>
                 <w:szCs w:val="18"/>
               </w:rPr>
-              <w:t>Editor</w:t>
-            </w:r>
-          </w:p>
-        </w:tc>
-        <w:tc>
-          <w:tcPr>
-            <w:tcW w:w="7254" w:type="dxa"/>
-            <w:tcBorders>
-              <w:top w:val="single" w:sz="4" w:space="0" w:color="BFBFBF"/>
-              <w:left w:val="single" w:sz="4" w:space="0" w:color="BFBFBF"/>
-              <w:bottom w:val="single" w:sz="4" w:space="0" w:color="BFBFBF"/>
-              <w:right w:val="single" w:sz="4" w:space="0" w:color="BFBFBF"/>
-            </w:tcBorders>
-            <w:shd w:val="clear" w:color="auto" w:fill="FFFFFF"/>
-            <w:tcMar>
-              <w:top w:w="70" w:type="dxa"/>
-              <w:left w:w="120" w:type="dxa"/>
-              <w:bottom w:w="70" w:type="dxa"/>
-              <w:right w:w="120" w:type="dxa"/>
-            </w:tcMar>
-            <w:vAlign w:val="center"/>
-          </w:tcPr>
-          <w:p>
+              <w:t>Alita Shrestha,</w:t>
+            </w:r>
             <w:r>
               <w:rPr>
                 <w:sz w:val="18"/>
                 <w:szCs w:val="18"/>
               </w:rPr>
-              <w:t>Fateme</w:t>
+              <w:t xml:space="preserve"> </w:t>
             </w:r>
             <w:r>
               <w:rPr>
                 <w:sz w:val="18"/>
                 <w:szCs w:val="18"/>
               </w:rPr>
-              <w:t xml:space="preserve"> </w:t>
+              <w:t>Fateme</w:t>
             </w:r>
             <w:r>
               <w:rPr>
                 <w:sz w:val="18"/>
                 <w:szCs w:val="18"/>
               </w:rPr>
-              <w:t>Hosseinzadeh</w:t>
+              <w:t xml:space="preserve"> </w:t>
             </w:r>
             <w:r>
               <w:rPr>
                 <w:sz w:val="18"/>
                 <w:szCs w:val="18"/>
               </w:rPr>
-              <w:t xml:space="preserve">, </w:t>
-            </w:r>
-            <w:proofErr w:type="spellStart"/>
+              <w:t>Hosseinzadeh</w:t>
+            </w:r>
             <w:r>
               <w:rPr>
                 <w:sz w:val="18"/>
                 <w:szCs w:val="18"/>
               </w:rPr>
-              <w:t>Thirthashri</w:t>
-            </w:r>
-            <w:proofErr w:type="spellEnd"/>
+              <w:t xml:space="preserve">, </w:t>
+            </w:r>
+            <w:proofErr w:type="spellStart"/>
             <w:r>
               <w:rPr>
                 <w:sz w:val="18"/>
                 <w:szCs w:val="18"/>
               </w:rPr>
-              <w:t xml:space="preserve"> </w:t>
-            </w:r>
-            <w:proofErr w:type="spellStart"/>
+              <w:t>Thirthashri</w:t>
+            </w:r>
+            <w:proofErr w:type="spellEnd"/>
             <w:r>
               <w:rPr>
                 <w:sz w:val="18"/>
                 <w:szCs w:val="18"/>
               </w:rPr>
-              <w:t>Gowli</w:t>
-            </w:r>
-            <w:proofErr w:type="spellEnd"/>
+              <w:t xml:space="preserve"> </w:t>
+            </w:r>
+            <w:proofErr w:type="spellStart"/>
             <w:r>
               <w:rPr>
                 <w:sz w:val="18"/>
                 <w:szCs w:val="18"/>
               </w:rPr>
-              <w:t xml:space="preserve"> Ganesh</w:t>
-            </w:r>
+              <w:t>Gowli</w:t>
+            </w:r>
+            <w:proofErr w:type="spellEnd"/>
             <w:r>
               <w:rPr>
                 <w:sz w:val="18"/>
                 <w:szCs w:val="18"/>
               </w:rPr>
-              <w:t>, Alita</w:t>
-            </w:r>
-            <w:r>
-              <w:rPr>
-                <w:sz w:val="18"/>
-                <w:szCs w:val="18"/>
-              </w:rPr>
-              <w:t xml:space="preserve"> Shrestha</w:t>
+              <w:t xml:space="preserve"> Ganesh</w:t>
             </w:r>
             <w:r>
               <w:rPr>

</xml_diff>